<commit_message>
fixed order and pivot and join
</commit_message>
<xml_diff>
--- a/docs/common_code/12_anova/anova.docx
+++ b/docs/common_code/12_anova/anova.docx
@@ -31,7 +31,7 @@
         <w:pStyle w:val="Date"/>
       </w:pPr>
       <w:r>
-        <w:t xml:space="preserve">2026-10-09</w:t>
+        <w:t xml:space="preserve">2026-10-19</w:t>
       </w:r>
     </w:p>
     <w:bookmarkStart w:id="12" w:name="one-way-anova"/>
@@ -2970,7 +2970,7 @@
     </w:p>
     <w:bookmarkEnd w:id="30"/>
     <w:bookmarkEnd w:id="31"/>
-    <w:bookmarkStart w:id="36" w:name="fit-the-model"/>
+    <w:bookmarkStart w:id="39" w:name="fit-the-model"/>
     <w:p>
       <w:pPr>
         <w:pStyle w:val="Heading1"/>
@@ -3039,7 +3039,7 @@
         <w:t xml:space="preserve"> </w:t>
       </w:r>
       <w:r>
-        <w:t xml:space="preserve">post-hoc tools. Use</w:t>
+        <w:t xml:space="preserve">post-hoc tools.</w:t>
       </w:r>
       <w:r>
         <w:t xml:space="preserve"> </w:t>
@@ -3054,7 +3054,7 @@
         <w:t xml:space="preserve"> </w:t>
       </w:r>
       <w:r>
-        <w:t xml:space="preserve">with</w:t>
+        <w:t xml:space="preserve">gives you the table; with no</w:t>
       </w:r>
       <w:r>
         <w:t xml:space="preserve"> </w:t>
@@ -3063,13 +3063,32 @@
         <w:rPr>
           <w:rStyle w:val="VerbatimChar"/>
         </w:rPr>
-        <w:t xml:space="preserve">type = "III"</w:t>
-      </w:r>
-      <w:r>
-        <w:t xml:space="preserve"> </w:t>
-      </w:r>
-      <w:r>
-        <w:t xml:space="preserve">for the ANOVA table.</w:t>
+        <w:t xml:space="preserve">type</w:t>
+      </w:r>
+      <w:r>
+        <w:t xml:space="preserve"> </w:t>
+      </w:r>
+      <w:r>
+        <w:t xml:space="preserve">argument it</w:t>
+      </w:r>
+      <w:r>
+        <w:t xml:space="preserve"> </w:t>
+      </w:r>
+      <w:r>
+        <w:t xml:space="preserve">uses</w:t>
+      </w:r>
+      <w:r>
+        <w:t xml:space="preserve"> </w:t>
+      </w:r>
+      <w:r>
+        <w:rPr>
+          <w:b/>
+          <w:bCs/>
+        </w:rPr>
+        <w:t xml:space="preserve">Type II</w:t>
+      </w:r>
+      <w:r>
+        <w:t xml:space="preserve">, which is the default to reach for.</w:t>
       </w:r>
     </w:p>
     <w:p>
@@ -3146,31 +3165,13 @@
         <w:rPr>
           <w:rStyle w:val="NormalTok"/>
         </w:rPr>
-        <w:t xml:space="preserve">(penguin_model, </w:t>
-      </w:r>
-      <w:r>
-        <w:rPr>
-          <w:rStyle w:val="AttributeTok"/>
-        </w:rPr>
-        <w:t xml:space="preserve">type =</w:t>
-      </w:r>
-      <w:r>
-        <w:rPr>
-          <w:rStyle w:val="NormalTok"/>
-        </w:rPr>
-        <w:t xml:space="preserve"> </w:t>
-      </w:r>
-      <w:r>
-        <w:rPr>
-          <w:rStyle w:val="StringTok"/>
-        </w:rPr>
-        <w:t xml:space="preserve">"III"</w:t>
-      </w:r>
-      <w:r>
-        <w:rPr>
-          <w:rStyle w:val="NormalTok"/>
-        </w:rPr>
-        <w:t xml:space="preserve">)</w:t>
+        <w:t xml:space="preserve">(penguin_model)          </w:t>
+      </w:r>
+      <w:r>
+        <w:rPr>
+          <w:rStyle w:val="CommentTok"/>
+        </w:rPr>
+        <w:t xml:space="preserve"># Type II — the default</w:t>
       </w:r>
     </w:p>
     <w:tbl>
@@ -3282,16 +3283,19 @@
               <w:rPr>
                 <w:rStyle w:val="VerbatimChar"/>
               </w:rPr>
-              <w:t xml:space="preserve">              Sum Sq  Df  F value     Pr(&gt;F)</w:t>
+              <w:t xml:space="preserve">Anova Table (Type II tests)</w:t>
             </w:r>
             <w:r>
               <w:br/>
             </w:r>
             <w:r>
+              <w:br/>
+            </w:r>
+            <w:r>
               <w:rPr>
                 <w:rStyle w:val="VerbatimChar"/>
               </w:rPr>
-              <w:t xml:space="preserve">(Intercept) 2.03e+09   1  5765.0   &lt; 2e-16 ***</w:t>
+              <w:t xml:space="preserve">Response: body_mass_g</w:t>
             </w:r>
             <w:r>
               <w:br/>
@@ -3300,7 +3304,7 @@
               <w:rPr>
                 <w:rStyle w:val="VerbatimChar"/>
               </w:rPr>
-              <w:t xml:space="preserve">species     1.46e+08   2   207.3   &lt; 2e-16 ***</w:t>
+              <w:t xml:space="preserve">             Sum Sq  Df F value    Pr(&gt;F)</w:t>
             </w:r>
             <w:r>
               <w:br/>
@@ -3309,7 +3313,16 @@
               <w:rPr>
                 <w:rStyle w:val="VerbatimChar"/>
               </w:rPr>
-              <w:t xml:space="preserve">Residuals   5.96e+07 339</w:t>
+              <w:t xml:space="preserve">species   146864214   2  343.63 &lt; 2.2e-16 ***</w:t>
+            </w:r>
+            <w:r>
+              <w:br/>
+            </w:r>
+            <w:r>
+              <w:rPr>
+                <w:rStyle w:val="VerbatimChar"/>
+              </w:rPr>
+              <w:t xml:space="preserve">Residuals  72443483 339</w:t>
             </w:r>
           </w:p>
           <w:p>
@@ -3594,10 +3607,10 @@
               <w:pStyle w:val="BodyText"/>
             </w:pPr>
             <w:pPr>
-              <w:spacing w:before="16" w:after="16"/>
-            </w:pPr>
-            <w:r>
-              <w:t xml:space="preserve">Always use</w:t>
+              <w:spacing w:before="16"/>
+            </w:pPr>
+            <w:r>
+              <w:t xml:space="preserve">Prefer</w:t>
             </w:r>
             <w:r>
               <w:t xml:space="preserve"> </w:t>
@@ -3606,10 +3619,13 @@
               <w:rPr>
                 <w:rStyle w:val="VerbatimChar"/>
               </w:rPr>
-              <w:t xml:space="preserve">car::Anova(model, type = "III")</w:t>
-            </w:r>
-            <w:r>
-              <w:t xml:space="preserve">, not base R</w:t>
+              <w:t xml:space="preserve">car::Anova(model)</w:t>
+            </w:r>
+            <w:r>
+              <w:t xml:space="preserve"> </w:t>
+            </w:r>
+            <w:r>
+              <w:t xml:space="preserve">over base R</w:t>
             </w:r>
             <w:r>
               <w:t xml:space="preserve"> </w:t>
@@ -3618,28 +3634,140 @@
               <w:rPr>
                 <w:rStyle w:val="VerbatimChar"/>
               </w:rPr>
+              <w:t xml:space="preserve">anova(model)</w:t>
+            </w:r>
+            <w:r>
+              <w:t xml:space="preserve">. The base function uses</w:t>
+            </w:r>
+            <w:r>
+              <w:t xml:space="preserve"> </w:t>
+            </w:r>
+            <w:r>
+              <w:rPr>
+                <w:b/>
+                <w:bCs/>
+              </w:rPr>
+              <w:t xml:space="preserve">Type I</w:t>
+            </w:r>
+            <w:r>
+              <w:t xml:space="preserve"> </w:t>
+            </w:r>
+            <w:r>
+              <w:t xml:space="preserve">sums of squares, which are sequential and therefore depend on the</w:t>
+            </w:r>
+            <w:r>
+              <w:t xml:space="preserve"> </w:t>
+            </w:r>
+            <w:r>
+              <w:t xml:space="preserve">order you list variables.</w:t>
+            </w:r>
+            <w:r>
+              <w:t xml:space="preserve"> </w:t>
+            </w:r>
+            <w:r>
+              <w:rPr>
+                <w:rStyle w:val="VerbatimChar"/>
+              </w:rPr>
+              <w:t xml:space="preserve">Anova()</w:t>
+            </w:r>
+            <w:r>
+              <w:t xml:space="preserve"> </w:t>
+            </w:r>
+            <w:r>
+              <w:t xml:space="preserve">defaults to</w:t>
+            </w:r>
+            <w:r>
+              <w:t xml:space="preserve"> </w:t>
+            </w:r>
+            <w:r>
+              <w:rPr>
+                <w:b/>
+                <w:bCs/>
+              </w:rPr>
+              <w:t xml:space="preserve">Type II</w:t>
+            </w:r>
+            <w:r>
+              <w:t xml:space="preserve">, which does not,</w:t>
+            </w:r>
+            <w:r>
+              <w:t xml:space="preserve"> </w:t>
+            </w:r>
+            <w:r>
+              <w:t xml:space="preserve">and is the safe choice for unbalanced designs.</w:t>
+            </w:r>
+          </w:p>
+          <w:p>
+            <w:pPr>
+              <w:pStyle w:val="BodyText"/>
+            </w:pPr>
+            <w:pPr>
+              <w:spacing w:after="16"/>
+            </w:pPr>
+            <w:r>
+              <w:t xml:space="preserve">Lowercase</w:t>
+            </w:r>
+            <w:r>
+              <w:t xml:space="preserve"> </w:t>
+            </w:r>
+            <w:r>
+              <w:rPr>
+                <w:rStyle w:val="VerbatimChar"/>
+              </w:rPr>
               <w:t xml:space="preserve">anova()</w:t>
             </w:r>
             <w:r>
-              <w:t xml:space="preserve">. The base</w:t>
-            </w:r>
-            <w:r>
-              <w:t xml:space="preserve"> </w:t>
-            </w:r>
-            <w:r>
-              <w:t xml:space="preserve">function uses Type I sums of squares, which depend on the order you list</w:t>
-            </w:r>
-            <w:r>
-              <w:t xml:space="preserve"> </w:t>
-            </w:r>
-            <w:r>
-              <w:t xml:space="preserve">variables. Type III tests each effect while accounting for all others — it is</w:t>
-            </w:r>
-            <w:r>
-              <w:t xml:space="preserve"> </w:t>
-            </w:r>
-            <w:r>
-              <w:t xml:space="preserve">the standard for publications and the only safe choice for unbalanced designs.</w:t>
+              <w:t xml:space="preserve"> </w:t>
+            </w:r>
+            <w:r>
+              <w:t xml:space="preserve">and capital</w:t>
+            </w:r>
+            <w:r>
+              <w:t xml:space="preserve"> </w:t>
+            </w:r>
+            <w:r>
+              <w:rPr>
+                <w:rStyle w:val="VerbatimChar"/>
+              </w:rPr>
+              <w:t xml:space="preserve">Anova()</w:t>
+            </w:r>
+            <w:r>
+              <w:t xml:space="preserve"> </w:t>
+            </w:r>
+            <w:r>
+              <w:t xml:space="preserve">are different functions from</w:t>
+            </w:r>
+            <w:r>
+              <w:t xml:space="preserve"> </w:t>
+            </w:r>
+            <w:r>
+              <w:t xml:space="preserve">different packages. Without</w:t>
+            </w:r>
+            <w:r>
+              <w:t xml:space="preserve"> </w:t>
+            </w:r>
+            <w:r>
+              <w:rPr>
+                <w:rStyle w:val="VerbatimChar"/>
+              </w:rPr>
+              <w:t xml:space="preserve">library(car)</w:t>
+            </w:r>
+            <w:r>
+              <w:t xml:space="preserve"> </w:t>
+            </w:r>
+            <w:r>
+              <w:t xml:space="preserve">you get</w:t>
+            </w:r>
+            <w:r>
+              <w:t xml:space="preserve"> </w:t>
+            </w:r>
+            <w:r>
+              <w:rPr>
+                <w:rStyle w:val="VerbatimChar"/>
+              </w:rPr>
+              <w:t xml:space="preserve">could not find function "Anova"</w:t>
+            </w:r>
+            <w:r>
+              <w:t xml:space="preserve">.</w:t>
             </w:r>
           </w:p>
           <w:p/>
@@ -3647,14 +3775,585 @@
       </w:tr>
     </w:tbl>
     <w:p>
+      <w:pPr>
+        <w:pStyle w:val="BodyText"/>
+      </w:pPr>
+      <w:r>
+        <w:t xml:space="preserve"> </w:t>
+      </w:r>
+    </w:p>
+    <w:tbl>
+      <w:tblPr>
+        <w:tblStyle w:val="Table"/>
+        <w:tblLook w:firstRow="0" w:lastRow="0" w:firstColumn="0" w:lastColumn="0" w:noHBand="0" w:noVBand="0" w:val="0000"/>
+        <w:tblBorders>
+          <w:top w:val="single" w:sz="4" w:space="0" w:color="CC1914"/>
+          <w:left w:val="single" w:sz="24" w:space="0" w:color="CC1914"/>
+          <w:bottom w:val="single" w:sz="4" w:space="0" w:color="CC1914"/>
+          <w:right w:val="single" w:sz="4" w:space="0" w:color="CC1914"/>
+        </w:tblBorders>
+        <w:tblCellMar>
+          <w:left w:w="144" w:type="dxa"/>
+          <w:right w:w="144" w:type="dxa"/>
+        </w:tblCellMar>
+        <w:tblLook w:firstRow="0" w:lastRow="0" w:firstColumn="0" w:lastColumn="0" w:noHBand="0" w:noVBand="0" w:val="0000"/>
+      </w:tblPr>
+      <w:tr>
+        <w:trPr>
+          <w:cantSplit/>
+        </w:trPr>
+        <w:tc>
+          <w:tcPr>
+            <w:shd w:color="auto" w:fill="f7dddc" w:val="clear"/>
+            <w:tcMar>
+              <w:top w:w="92" w:type="dxa"/>
+              <w:bottom w:w="92" w:type="dxa"/>
+            </w:tcMar>
+          </w:tcPr>
+          <w:p>
+            <w:pPr>
+              <w:pStyle w:val="BodyText"/>
+            </w:pPr>
+            <w:pPr>
+              <w:spacing w:before="0" w:after="0"/>
+              <w:textAlignment w:val="center"/>
+            </w:pPr>
+            <w:r>
+              <w:drawing>
+                <wp:inline>
+                  <wp:extent cx="152400" cy="152400"/>
+                  <wp:effectExtent b="0" l="0" r="0" t="0"/>
+                  <wp:docPr descr="" title="" id="37" name="Picture"/>
+                  <a:graphic>
+                    <a:graphicData uri="http://schemas.openxmlformats.org/drawingml/2006/picture">
+                      <pic:pic>
+                        <pic:nvPicPr>
+                          <pic:cNvPr descr="/Applications/Positron.app/Contents/Resources/app/quarto/share/formats/docx/important.png" id="38" name="Picture"/>
+                          <pic:cNvPicPr>
+                            <a:picLocks noChangeArrowheads="1" noChangeAspect="1"/>
+                          </pic:cNvPicPr>
+                        </pic:nvPicPr>
+                        <pic:blipFill>
+                          <a:blip r:embed="rId36"/>
+                          <a:stretch>
+                            <a:fillRect/>
+                          </a:stretch>
+                        </pic:blipFill>
+                        <pic:spPr bwMode="auto">
+                          <a:xfrm>
+                            <a:off x="0" y="0"/>
+                            <a:ext cx="152400" cy="152400"/>
+                          </a:xfrm>
+                          <a:prstGeom prst="rect">
+                            <a:avLst/>
+                          </a:prstGeom>
+                          <a:noFill/>
+                          <a:ln w="9525">
+                            <a:noFill/>
+                            <a:headEnd/>
+                            <a:tailEnd/>
+                          </a:ln>
+                        </pic:spPr>
+                      </pic:pic>
+                    </a:graphicData>
+                  </a:graphic>
+                </wp:inline>
+              </w:drawing>
+            </w:r>
+            <w:r>
+              <w:t xml:space="preserve"> </w:t>
+            </w:r>
+            <w:r>
+              <w:t xml:space="preserve"> </w:t>
+            </w:r>
+            <w:r>
+              <w:t xml:space="preserve">Type III needs a different contrast coding</w:t>
+            </w:r>
+          </w:p>
+        </w:tc>
+      </w:tr>
+      <w:tr>
+        <w:trPr>
+          <w:cantSplit/>
+        </w:trPr>
+        <w:tc>
+          <w:tcPr>
+            <w:tcMar>
+              <w:top w:w="108" w:type="dxa"/>
+              <w:bottom w:w="108" w:type="dxa"/>
+            </w:tcMar>
+          </w:tcPr>
+          <w:p>
+            <w:pPr>
+              <w:pStyle w:val="BodyText"/>
+            </w:pPr>
+            <w:pPr>
+              <w:spacing w:before="16"/>
+            </w:pPr>
+            <w:r>
+              <w:rPr>
+                <w:rStyle w:val="VerbatimChar"/>
+              </w:rPr>
+              <w:t xml:space="preserve">Anova(model, type = 3)</w:t>
+            </w:r>
+            <w:r>
+              <w:t xml:space="preserve"> </w:t>
+            </w:r>
+            <w:r>
+              <w:t xml:space="preserve">is only a genuine Type III test when the factors are</w:t>
+            </w:r>
+            <w:r>
+              <w:t xml:space="preserve"> </w:t>
+            </w:r>
+            <w:r>
+              <w:t xml:space="preserve">coded against the</w:t>
+            </w:r>
+            <w:r>
+              <w:t xml:space="preserve"> </w:t>
+            </w:r>
+            <w:r>
+              <w:rPr>
+                <w:b/>
+                <w:bCs/>
+              </w:rPr>
+              <w:t xml:space="preserve">grand mean</w:t>
+            </w:r>
+            <w:r>
+              <w:t xml:space="preserve"> </w:t>
+            </w:r>
+            <w:r>
+              <w:t xml:space="preserve">(</w:t>
+            </w:r>
+            <w:r>
+              <w:rPr>
+                <w:rStyle w:val="VerbatimChar"/>
+              </w:rPr>
+              <w:t xml:space="preserve">contr.sum</w:t>
+            </w:r>
+            <w:r>
+              <w:t xml:space="preserve">) rather than against a baseline</w:t>
+            </w:r>
+            <w:r>
+              <w:t xml:space="preserve"> </w:t>
+            </w:r>
+            <w:r>
+              <w:t xml:space="preserve">group (</w:t>
+            </w:r>
+            <w:r>
+              <w:rPr>
+                <w:rStyle w:val="VerbatimChar"/>
+              </w:rPr>
+              <w:t xml:space="preserve">contr.treatment</w:t>
+            </w:r>
+            <w:r>
+              <w:t xml:space="preserve">, which is R’s default). Ask for Type III on a</w:t>
+            </w:r>
+            <w:r>
+              <w:t xml:space="preserve"> </w:t>
+            </w:r>
+            <w:r>
+              <w:t xml:space="preserve">treatment-coded model and</w:t>
+            </w:r>
+            <w:r>
+              <w:t xml:space="preserve"> </w:t>
+            </w:r>
+            <w:r>
+              <w:rPr>
+                <w:rStyle w:val="VerbatimChar"/>
+              </w:rPr>
+              <w:t xml:space="preserve">car</w:t>
+            </w:r>
+            <w:r>
+              <w:t xml:space="preserve"> </w:t>
+            </w:r>
+            <w:r>
+              <w:t xml:space="preserve">still prints a table — the</w:t>
+            </w:r>
+            <w:r>
+              <w:t xml:space="preserve"> </w:t>
+            </w:r>
+            <w:r>
+              <w:rPr>
+                <w:rStyle w:val="VerbatimChar"/>
+              </w:rPr>
+              <w:t xml:space="preserve">(Intercept)</w:t>
+            </w:r>
+            <w:r>
+              <w:t xml:space="preserve"> </w:t>
+            </w:r>
+            <w:r>
+              <w:t xml:space="preserve">row</w:t>
+            </w:r>
+            <w:r>
+              <w:t xml:space="preserve"> </w:t>
+            </w:r>
+            <w:r>
+              <w:t xml:space="preserve">just is not testing what you think.</w:t>
+            </w:r>
+          </w:p>
+          <w:p>
+            <w:pPr>
+              <w:pStyle w:val="BodyText"/>
+            </w:pPr>
+            <w:r>
+              <w:t xml:space="preserve">The four-line pattern —</w:t>
+            </w:r>
+            <w:r>
+              <w:t xml:space="preserve"> </w:t>
+            </w:r>
+            <w:r>
+              <w:rPr>
+                <w:b/>
+                <w:bCs/>
+              </w:rPr>
+              <w:t xml:space="preserve">set, refit, test, set back</w:t>
+            </w:r>
+            <w:r>
+              <w:t xml:space="preserve">:</w:t>
+            </w:r>
+          </w:p>
+          <w:p>
+            <w:pPr>
+              <w:pStyle w:val="SourceCode"/>
+            </w:pPr>
+            <w:r>
+              <w:rPr>
+                <w:rStyle w:val="FunctionTok"/>
+              </w:rPr>
+              <w:t xml:space="preserve">options</w:t>
+            </w:r>
+            <w:r>
+              <w:rPr>
+                <w:rStyle w:val="NormalTok"/>
+              </w:rPr>
+              <w:t xml:space="preserve">(</w:t>
+            </w:r>
+            <w:r>
+              <w:rPr>
+                <w:rStyle w:val="AttributeTok"/>
+              </w:rPr>
+              <w:t xml:space="preserve">contrasts =</w:t>
+            </w:r>
+            <w:r>
+              <w:rPr>
+                <w:rStyle w:val="NormalTok"/>
+              </w:rPr>
+              <w:t xml:space="preserve"> </w:t>
+            </w:r>
+            <w:r>
+              <w:rPr>
+                <w:rStyle w:val="FunctionTok"/>
+              </w:rPr>
+              <w:t xml:space="preserve">c</w:t>
+            </w:r>
+            <w:r>
+              <w:rPr>
+                <w:rStyle w:val="NormalTok"/>
+              </w:rPr>
+              <w:t xml:space="preserve">(</w:t>
+            </w:r>
+            <w:r>
+              <w:rPr>
+                <w:rStyle w:val="StringTok"/>
+              </w:rPr>
+              <w:t xml:space="preserve">"contr.sum"</w:t>
+            </w:r>
+            <w:r>
+              <w:rPr>
+                <w:rStyle w:val="NormalTok"/>
+              </w:rPr>
+              <w:t xml:space="preserve">, </w:t>
+            </w:r>
+            <w:r>
+              <w:rPr>
+                <w:rStyle w:val="StringTok"/>
+              </w:rPr>
+              <w:t xml:space="preserve">"contr.poly"</w:t>
+            </w:r>
+            <w:r>
+              <w:rPr>
+                <w:rStyle w:val="NormalTok"/>
+              </w:rPr>
+              <w:t xml:space="preserve">))</w:t>
+            </w:r>
+            <w:r>
+              <w:br/>
+            </w:r>
+            <w:r>
+              <w:br/>
+            </w:r>
+            <w:r>
+              <w:rPr>
+                <w:rStyle w:val="NormalTok"/>
+              </w:rPr>
+              <w:t xml:space="preserve">penguin_model_sum </w:t>
+            </w:r>
+            <w:r>
+              <w:rPr>
+                <w:rStyle w:val="OtherTok"/>
+              </w:rPr>
+              <w:t xml:space="preserve">&lt;-</w:t>
+            </w:r>
+            <w:r>
+              <w:rPr>
+                <w:rStyle w:val="NormalTok"/>
+              </w:rPr>
+              <w:t xml:space="preserve"> </w:t>
+            </w:r>
+            <w:r>
+              <w:rPr>
+                <w:rStyle w:val="FunctionTok"/>
+              </w:rPr>
+              <w:t xml:space="preserve">lm</w:t>
+            </w:r>
+            <w:r>
+              <w:rPr>
+                <w:rStyle w:val="NormalTok"/>
+              </w:rPr>
+              <w:t xml:space="preserve">(body_mass_g </w:t>
+            </w:r>
+            <w:r>
+              <w:rPr>
+                <w:rStyle w:val="SpecialCharTok"/>
+              </w:rPr>
+              <w:t xml:space="preserve">~</w:t>
+            </w:r>
+            <w:r>
+              <w:rPr>
+                <w:rStyle w:val="NormalTok"/>
+              </w:rPr>
+              <w:t xml:space="preserve"> species, </w:t>
+            </w:r>
+            <w:r>
+              <w:rPr>
+                <w:rStyle w:val="AttributeTok"/>
+              </w:rPr>
+              <w:t xml:space="preserve">data =</w:t>
+            </w:r>
+            <w:r>
+              <w:rPr>
+                <w:rStyle w:val="NormalTok"/>
+              </w:rPr>
+              <w:t xml:space="preserve"> penguins_anova)</w:t>
+            </w:r>
+            <w:r>
+              <w:br/>
+            </w:r>
+            <w:r>
+              <w:br/>
+            </w:r>
+            <w:r>
+              <w:rPr>
+                <w:rStyle w:val="FunctionTok"/>
+              </w:rPr>
+              <w:t xml:space="preserve">Anova</w:t>
+            </w:r>
+            <w:r>
+              <w:rPr>
+                <w:rStyle w:val="NormalTok"/>
+              </w:rPr>
+              <w:t xml:space="preserve">(penguin_model_sum, </w:t>
+            </w:r>
+            <w:r>
+              <w:rPr>
+                <w:rStyle w:val="AttributeTok"/>
+              </w:rPr>
+              <w:t xml:space="preserve">type =</w:t>
+            </w:r>
+            <w:r>
+              <w:rPr>
+                <w:rStyle w:val="NormalTok"/>
+              </w:rPr>
+              <w:t xml:space="preserve"> </w:t>
+            </w:r>
+            <w:r>
+              <w:rPr>
+                <w:rStyle w:val="DecValTok"/>
+              </w:rPr>
+              <w:t xml:space="preserve">3</w:t>
+            </w:r>
+            <w:r>
+              <w:rPr>
+                <w:rStyle w:val="NormalTok"/>
+              </w:rPr>
+              <w:t xml:space="preserve">)</w:t>
+            </w:r>
+            <w:r>
+              <w:br/>
+            </w:r>
+            <w:r>
+              <w:br/>
+            </w:r>
+            <w:r>
+              <w:rPr>
+                <w:rStyle w:val="FunctionTok"/>
+              </w:rPr>
+              <w:t xml:space="preserve">options</w:t>
+            </w:r>
+            <w:r>
+              <w:rPr>
+                <w:rStyle w:val="NormalTok"/>
+              </w:rPr>
+              <w:t xml:space="preserve">(</w:t>
+            </w:r>
+            <w:r>
+              <w:rPr>
+                <w:rStyle w:val="AttributeTok"/>
+              </w:rPr>
+              <w:t xml:space="preserve">contrasts =</w:t>
+            </w:r>
+            <w:r>
+              <w:rPr>
+                <w:rStyle w:val="NormalTok"/>
+              </w:rPr>
+              <w:t xml:space="preserve"> </w:t>
+            </w:r>
+            <w:r>
+              <w:rPr>
+                <w:rStyle w:val="FunctionTok"/>
+              </w:rPr>
+              <w:t xml:space="preserve">c</w:t>
+            </w:r>
+            <w:r>
+              <w:rPr>
+                <w:rStyle w:val="NormalTok"/>
+              </w:rPr>
+              <w:t xml:space="preserve">(</w:t>
+            </w:r>
+            <w:r>
+              <w:rPr>
+                <w:rStyle w:val="StringTok"/>
+              </w:rPr>
+              <w:t xml:space="preserve">"contr.treatment"</w:t>
+            </w:r>
+            <w:r>
+              <w:rPr>
+                <w:rStyle w:val="NormalTok"/>
+              </w:rPr>
+              <w:t xml:space="preserve">, </w:t>
+            </w:r>
+            <w:r>
+              <w:rPr>
+                <w:rStyle w:val="StringTok"/>
+              </w:rPr>
+              <w:t xml:space="preserve">"contr.poly"</w:t>
+            </w:r>
+            <w:r>
+              <w:rPr>
+                <w:rStyle w:val="NormalTok"/>
+              </w:rPr>
+              <w:t xml:space="preserve">))</w:t>
+            </w:r>
+          </w:p>
+          <w:p>
+            <w:pPr>
+              <w:pStyle w:val="FirstParagraph"/>
+            </w:pPr>
+            <w:r>
+              <w:t xml:space="preserve">The</w:t>
+            </w:r>
+            <w:r>
+              <w:t xml:space="preserve"> </w:t>
+            </w:r>
+            <w:r>
+              <w:rPr>
+                <w:b/>
+                <w:bCs/>
+              </w:rPr>
+              <w:t xml:space="preserve">refit</w:t>
+            </w:r>
+            <w:r>
+              <w:t xml:space="preserve"> </w:t>
+            </w:r>
+            <w:r>
+              <w:t xml:space="preserve">is not optional: a model stores the coding it was fitted with, so</w:t>
+            </w:r>
+            <w:r>
+              <w:t xml:space="preserve"> </w:t>
+            </w:r>
+            <w:r>
+              <w:t xml:space="preserve">changing the option and reusing the old model does nothing. And</w:t>
+            </w:r>
+            <w:r>
+              <w:t xml:space="preserve"> </w:t>
+            </w:r>
+            <w:r>
+              <w:rPr>
+                <w:rStyle w:val="VerbatimChar"/>
+              </w:rPr>
+              <w:t xml:space="preserve">options()</w:t>
+            </w:r>
+            <w:r>
+              <w:t xml:space="preserve"> </w:t>
+            </w:r>
+            <w:r>
+              <w:t xml:space="preserve">is</w:t>
+            </w:r>
+            <w:r>
+              <w:t xml:space="preserve"> </w:t>
+            </w:r>
+            <w:r>
+              <w:t xml:space="preserve">global and sticky — set it back, or every model you fit later in the session is</w:t>
+            </w:r>
+            <w:r>
+              <w:t xml:space="preserve"> </w:t>
+            </w:r>
+            <w:r>
+              <w:t xml:space="preserve">coded differently too.</w:t>
+            </w:r>
+          </w:p>
+          <w:p>
+            <w:pPr>
+              <w:pStyle w:val="BodyText"/>
+            </w:pPr>
+            <w:pPr>
+              <w:spacing w:after="16"/>
+            </w:pPr>
+            <w:r>
+              <w:t xml:space="preserve">With a</w:t>
+            </w:r>
+            <w:r>
+              <w:t xml:space="preserve"> </w:t>
+            </w:r>
+            <w:r>
+              <w:rPr>
+                <w:b/>
+                <w:bCs/>
+              </w:rPr>
+              <w:t xml:space="preserve">single</w:t>
+            </w:r>
+            <w:r>
+              <w:t xml:space="preserve"> </w:t>
+            </w:r>
+            <w:r>
+              <w:t xml:space="preserve">factor, all of Type I, II and III give the same F for that</w:t>
+            </w:r>
+            <w:r>
+              <w:t xml:space="preserve"> </w:t>
+            </w:r>
+            <w:r>
+              <w:t xml:space="preserve">factor; only the intercept row moves. The type genuinely changes the answer</w:t>
+            </w:r>
+            <w:r>
+              <w:t xml:space="preserve"> </w:t>
+            </w:r>
+            <w:r>
+              <w:t xml:space="preserve">once you have two or more unbalanced predictors.</w:t>
+            </w:r>
+          </w:p>
+          <w:p/>
+        </w:tc>
+      </w:tr>
+    </w:tbl>
+    <w:p>
       <w:r>
         <w:pict>
           <v:rect style="width:0;height:1.5pt" o:hralign="center" o:hrstd="t" o:hr="t"/>
         </w:pict>
       </w:r>
     </w:p>
-    <w:bookmarkEnd w:id="36"/>
-    <w:bookmarkStart w:id="47" w:name="check-the-assumptions"/>
+    <w:bookmarkEnd w:id="39"/>
+    <w:bookmarkStart w:id="50" w:name="check-the-assumptions"/>
     <w:p>
       <w:pPr>
         <w:pStyle w:val="Heading1"/>
@@ -3888,12 +4587,12 @@
                 <wp:inline>
                   <wp:extent cx="152400" cy="152400"/>
                   <wp:effectExtent b="0" l="0" r="0" t="0"/>
-                  <wp:docPr descr="" title="" id="37" name="Picture"/>
+                  <wp:docPr descr="" title="" id="40" name="Picture"/>
                   <a:graphic>
                     <a:graphicData uri="http://schemas.openxmlformats.org/drawingml/2006/picture">
                       <pic:pic>
                         <pic:nvPicPr>
-                          <pic:cNvPr descr="/Applications/Positron.app/Contents/Resources/app/quarto/share/formats/docx/tip.png" id="38" name="Picture"/>
+                          <pic:cNvPr descr="/Applications/Positron.app/Contents/Resources/app/quarto/share/formats/docx/tip.png" id="41" name="Picture"/>
                           <pic:cNvPicPr>
                             <a:picLocks noChangeArrowheads="1" noChangeAspect="1"/>
                           </pic:cNvPicPr>
@@ -3985,7 +4684,7 @@
         </w:tc>
       </w:tr>
     </w:tbl>
-    <w:bookmarkStart w:id="39" w:name="residuals-vs-fitted-check-equal-variance"/>
+    <w:bookmarkStart w:id="42" w:name="residuals-vs-fitted-check-equal-variance"/>
     <w:p>
       <w:pPr>
         <w:pStyle w:val="Heading3"/>
@@ -4671,8 +5370,8 @@
         <w:t xml:space="preserve">unequal variance.</w:t>
       </w:r>
     </w:p>
-    <w:bookmarkEnd w:id="39"/>
-    <w:bookmarkStart w:id="40" w:name="q-q-plot-check-normality-of-residuals"/>
+    <w:bookmarkEnd w:id="42"/>
+    <w:bookmarkStart w:id="43" w:name="q-q-plot-check-normality-of-residuals"/>
     <w:p>
       <w:pPr>
         <w:pStyle w:val="Heading3"/>
@@ -5016,8 +5715,8 @@
         <w:t xml:space="preserve">strong deviations at the tails indicate non-normality.</w:t>
       </w:r>
     </w:p>
-    <w:bookmarkEnd w:id="40"/>
-    <w:bookmarkStart w:id="41" w:name="levenes-test-equal-variance"/>
+    <w:bookmarkEnd w:id="43"/>
+    <w:bookmarkStart w:id="44" w:name="levenes-test-equal-variance"/>
     <w:p>
       <w:pPr>
         <w:pStyle w:val="Heading3"/>
@@ -5067,8 +5766,8 @@
         <w:t xml:space="preserve"> penguins_anova)</w:t>
       </w:r>
     </w:p>
-    <w:bookmarkEnd w:id="41"/>
-    <w:bookmarkStart w:id="46" w:name="shapiro-wilk-normality-of-residuals"/>
+    <w:bookmarkEnd w:id="44"/>
+    <w:bookmarkStart w:id="49" w:name="shapiro-wilk-normality-of-residuals"/>
     <w:p>
       <w:pPr>
         <w:pStyle w:val="Heading3"/>
@@ -5147,12 +5846,12 @@
                 <wp:inline>
                   <wp:extent cx="152400" cy="152400"/>
                   <wp:effectExtent b="0" l="0" r="0" t="0"/>
-                  <wp:docPr descr="" title="" id="42" name="Picture"/>
+                  <wp:docPr descr="" title="" id="45" name="Picture"/>
                   <a:graphic>
                     <a:graphicData uri="http://schemas.openxmlformats.org/drawingml/2006/picture">
                       <pic:pic>
                         <pic:nvPicPr>
-                          <pic:cNvPr descr="/Applications/Positron.app/Contents/Resources/app/quarto/share/formats/docx/note.png" id="43" name="Picture"/>
+                          <pic:cNvPr descr="/Applications/Positron.app/Contents/Resources/app/quarto/share/formats/docx/note.png" id="46" name="Picture"/>
                           <pic:cNvPicPr>
                             <a:picLocks noChangeArrowheads="1" noChangeAspect="1"/>
                           </pic:cNvPicPr>
@@ -5263,13 +5962,198 @@
               <w:t xml:space="preserve">With n &gt; 30 per group, ANOVA is fairly robust to moderate non-normality (Central Limit Theorem). Trust the Q-Q plot over the Shapiro-Wilk p-value in larger samples.</w:t>
             </w:r>
           </w:p>
+          <w:p>
+            <w:pPr>
+              <w:pStyle w:val="FirstParagraph"/>
+            </w:pPr>
+            <w:r>
+              <w:rPr>
+                <w:b/>
+                <w:bCs/>
+              </w:rPr>
+              <w:t xml:space="preserve">On this data set:</w:t>
+            </w:r>
+            <w:r>
+              <w:t xml:space="preserve"> </w:t>
+            </w:r>
+            <w:r>
+              <w:t xml:space="preserve">Shapiro-Wilk gives</w:t>
+            </w:r>
+            <w:r>
+              <w:t xml:space="preserve"> </w:t>
+            </w:r>
+            <w:r>
+              <w:rPr>
+                <w:i/>
+                <w:iCs/>
+              </w:rPr>
+              <w:t xml:space="preserve">W</w:t>
+            </w:r>
+            <w:r>
+              <w:t xml:space="preserve"> </w:t>
+            </w:r>
+            <w:r>
+              <w:t xml:space="preserve">= 0.992,</w:t>
+            </w:r>
+            <w:r>
+              <w:t xml:space="preserve"> </w:t>
+            </w:r>
+            <w:r>
+              <w:rPr>
+                <w:i/>
+                <w:iCs/>
+              </w:rPr>
+              <w:t xml:space="preserve">p</w:t>
+            </w:r>
+            <w:r>
+              <w:t xml:space="preserve"> </w:t>
+            </w:r>
+            <w:r>
+              <w:t xml:space="preserve">= 0.051 (fine — the</w:t>
+            </w:r>
+            <w:r>
+              <w:t xml:space="preserve"> </w:t>
+            </w:r>
+            <w:r>
+              <w:t xml:space="preserve">Q-Q plot tracks the line), but Levene’s test gives F(2, 339) = 5.12,</w:t>
+            </w:r>
+            <w:r>
+              <w:t xml:space="preserve"> </w:t>
+            </w:r>
+            <w:r>
+              <w:rPr>
+                <w:b/>
+                <w:bCs/>
+              </w:rPr>
+              <w:t xml:space="preserve">p = 0.006</w:t>
+            </w:r>
+            <w:r>
+              <w:t xml:space="preserve"> </w:t>
+            </w:r>
+            <w:r>
+              <w:t xml:space="preserve">— the variances are</w:t>
+            </w:r>
+            <w:r>
+              <w:t xml:space="preserve"> </w:t>
+            </w:r>
+            <w:r>
+              <w:rPr>
+                <w:b/>
+                <w:bCs/>
+              </w:rPr>
+              <w:t xml:space="preserve">not</w:t>
+            </w:r>
+            <w:r>
+              <w:t xml:space="preserve"> </w:t>
+            </w:r>
+            <w:r>
+              <w:t xml:space="preserve">equal. The group sds are 459, 384 and</w:t>
+            </w:r>
+            <w:r>
+              <w:t xml:space="preserve"> </w:t>
+            </w:r>
+            <w:r>
+              <w:t xml:space="preserve">504 g with unbalanced n (151 / 68 / 123), which is exactly the case where that</w:t>
+            </w:r>
+            <w:r>
+              <w:t xml:space="preserve"> </w:t>
+            </w:r>
+            <w:r>
+              <w:t xml:space="preserve">matters. The honest test to report is then Welch’s:</w:t>
+            </w:r>
+          </w:p>
+          <w:p>
+            <w:pPr>
+              <w:pStyle w:val="SourceCode"/>
+            </w:pPr>
+            <w:r>
+              <w:rPr>
+                <w:rStyle w:val="FunctionTok"/>
+              </w:rPr>
+              <w:t xml:space="preserve">oneway.test</w:t>
+            </w:r>
+            <w:r>
+              <w:rPr>
+                <w:rStyle w:val="NormalTok"/>
+              </w:rPr>
+              <w:t xml:space="preserve">(body_mass_g </w:t>
+            </w:r>
+            <w:r>
+              <w:rPr>
+                <w:rStyle w:val="SpecialCharTok"/>
+              </w:rPr>
+              <w:t xml:space="preserve">~</w:t>
+            </w:r>
+            <w:r>
+              <w:rPr>
+                <w:rStyle w:val="NormalTok"/>
+              </w:rPr>
+              <w:t xml:space="preserve"> species, </w:t>
+            </w:r>
+            <w:r>
+              <w:rPr>
+                <w:rStyle w:val="AttributeTok"/>
+              </w:rPr>
+              <w:t xml:space="preserve">data =</w:t>
+            </w:r>
+            <w:r>
+              <w:rPr>
+                <w:rStyle w:val="NormalTok"/>
+              </w:rPr>
+              <w:t xml:space="preserve"> penguins_anova, </w:t>
+            </w:r>
+            <w:r>
+              <w:rPr>
+                <w:rStyle w:val="AttributeTok"/>
+              </w:rPr>
+              <w:t xml:space="preserve">var.equal =</w:t>
+            </w:r>
+            <w:r>
+              <w:rPr>
+                <w:rStyle w:val="NormalTok"/>
+              </w:rPr>
+              <w:t xml:space="preserve"> </w:t>
+            </w:r>
+            <w:r>
+              <w:rPr>
+                <w:rStyle w:val="ConstantTok"/>
+              </w:rPr>
+              <w:t xml:space="preserve">FALSE</w:t>
+            </w:r>
+            <w:r>
+              <w:rPr>
+                <w:rStyle w:val="NormalTok"/>
+              </w:rPr>
+              <w:t xml:space="preserve">)</w:t>
+            </w:r>
+            <w:r>
+              <w:br/>
+            </w:r>
+            <w:r>
+              <w:rPr>
+                <w:rStyle w:val="CommentTok"/>
+              </w:rPr>
+              <w:t xml:space="preserve">#&gt; F = 317.57, num df = 2.00, denom df = 189.48, p-value &lt; 2.2e-16</w:t>
+            </w:r>
+          </w:p>
+          <w:p>
+            <w:pPr>
+              <w:pStyle w:val="FirstParagraph"/>
+            </w:pPr>
+            <w:pPr>
+              <w:spacing w:after="16"/>
+            </w:pPr>
+            <w:r>
+              <w:t xml:space="preserve">The conclusion does not change here — but you only know that after you look.</w:t>
+            </w:r>
+          </w:p>
           <w:p/>
         </w:tc>
       </w:tr>
     </w:tbl>
     <w:p>
       <w:pPr>
-        <w:pStyle w:val="FirstParagraph"/>
+        <w:pStyle w:val="BodyText"/>
       </w:pPr>
       <w:r>
         <w:t xml:space="preserve"> </w:t>
@@ -5316,12 +6200,12 @@
                 <wp:inline>
                   <wp:extent cx="152400" cy="152400"/>
                   <wp:effectExtent b="0" l="0" r="0" t="0"/>
-                  <wp:docPr descr="" title="" id="44" name="Picture"/>
+                  <wp:docPr descr="" title="" id="47" name="Picture"/>
                   <a:graphic>
                     <a:graphicData uri="http://schemas.openxmlformats.org/drawingml/2006/picture">
                       <pic:pic>
                         <pic:nvPicPr>
-                          <pic:cNvPr descr="/Applications/Positron.app/Contents/Resources/app/quarto/share/formats/docx/warning.png" id="45" name="Picture"/>
+                          <pic:cNvPr descr="/Applications/Positron.app/Contents/Resources/app/quarto/share/formats/docx/warning.png" id="48" name="Picture"/>
                           <pic:cNvPicPr>
                             <a:picLocks noChangeArrowheads="1" noChangeAspect="1"/>
                           </pic:cNvPicPr>
@@ -5452,9 +6336,9 @@
         </w:pict>
       </w:r>
     </w:p>
-    <w:bookmarkEnd w:id="46"/>
-    <w:bookmarkEnd w:id="47"/>
-    <w:bookmarkStart w:id="55" w:name="post-hoc-tests-with-emmeans"/>
+    <w:bookmarkEnd w:id="49"/>
+    <w:bookmarkEnd w:id="50"/>
+    <w:bookmarkStart w:id="58" w:name="post-hoc-tests-with-emmeans"/>
     <w:p>
       <w:pPr>
         <w:pStyle w:val="Heading1"/>
@@ -5508,7 +6392,7 @@
         <w:t xml:space="preserve">.</w:t>
       </w:r>
     </w:p>
-    <w:bookmarkStart w:id="48" w:name="estimated-marginal-means"/>
+    <w:bookmarkStart w:id="51" w:name="estimated-marginal-means"/>
     <w:p>
       <w:pPr>
         <w:pStyle w:val="Heading3"/>
@@ -5581,8 +6465,8 @@
         <w:t xml:space="preserve">This gives the estimated mean body mass for each species with its SE and 95% CI.</w:t>
       </w:r>
     </w:p>
-    <w:bookmarkEnd w:id="48"/>
-    <w:bookmarkStart w:id="51" w:name="all-pairwise-contrasts-tukey-adjustment"/>
+    <w:bookmarkEnd w:id="51"/>
+    <w:bookmarkStart w:id="54" w:name="all-pairwise-contrasts-tukey-adjustment"/>
     <w:p>
       <w:pPr>
         <w:pStyle w:val="Heading3"/>
@@ -5673,12 +6557,12 @@
                 <wp:inline>
                   <wp:extent cx="152400" cy="152400"/>
                   <wp:effectExtent b="0" l="0" r="0" t="0"/>
-                  <wp:docPr descr="" title="" id="49" name="Picture"/>
+                  <wp:docPr descr="" title="" id="52" name="Picture"/>
                   <a:graphic>
                     <a:graphicData uri="http://schemas.openxmlformats.org/drawingml/2006/picture">
                       <pic:pic>
                         <pic:nvPicPr>
-                          <pic:cNvPr descr="/Applications/Positron.app/Contents/Resources/app/quarto/share/formats/docx/note.png" id="50" name="Picture"/>
+                          <pic:cNvPr descr="/Applications/Positron.app/Contents/Resources/app/quarto/share/formats/docx/note.png" id="53" name="Picture"/>
                           <pic:cNvPicPr>
                             <a:picLocks noChangeArrowheads="1" noChangeAspect="1"/>
                           </pic:cNvPicPr>
@@ -5880,8 +6764,8 @@
         </w:tc>
       </w:tr>
     </w:tbl>
-    <w:bookmarkEnd w:id="51"/>
-    <w:bookmarkStart w:id="54" w:name="compact-letter-display-a-b-c-labels"/>
+    <w:bookmarkEnd w:id="54"/>
+    <w:bookmarkStart w:id="57" w:name="compact-letter-display-a-b-c-labels"/>
     <w:p>
       <w:pPr>
         <w:pStyle w:val="Heading3"/>
@@ -6160,12 +7044,12 @@
                 <wp:inline>
                   <wp:extent cx="152400" cy="152400"/>
                   <wp:effectExtent b="0" l="0" r="0" t="0"/>
-                  <wp:docPr descr="" title="" id="52" name="Picture"/>
+                  <wp:docPr descr="" title="" id="55" name="Picture"/>
                   <a:graphic>
                     <a:graphicData uri="http://schemas.openxmlformats.org/drawingml/2006/picture">
                       <pic:pic>
                         <pic:nvPicPr>
-                          <pic:cNvPr descr="/Applications/Positron.app/Contents/Resources/app/quarto/share/formats/docx/tip.png" id="53" name="Picture"/>
+                          <pic:cNvPr descr="/Applications/Positron.app/Contents/Resources/app/quarto/share/formats/docx/tip.png" id="56" name="Picture"/>
                           <pic:cNvPicPr>
                             <a:picLocks noChangeArrowheads="1" noChangeAspect="1"/>
                           </pic:cNvPicPr>
@@ -6375,9 +7259,9 @@
         </w:pict>
       </w:r>
     </w:p>
-    <w:bookmarkEnd w:id="54"/>
-    <w:bookmarkEnd w:id="55"/>
-    <w:bookmarkStart w:id="58" w:name="effect-size-eta-squared-η²"/>
+    <w:bookmarkEnd w:id="57"/>
+    <w:bookmarkEnd w:id="58"/>
+    <w:bookmarkStart w:id="61" w:name="effect-size-eta-squared-η²"/>
     <w:p>
       <w:pPr>
         <w:pStyle w:val="Heading1"/>
@@ -6723,12 +7607,12 @@
                 <wp:inline>
                   <wp:extent cx="152400" cy="152400"/>
                   <wp:effectExtent b="0" l="0" r="0" t="0"/>
-                  <wp:docPr descr="" title="" id="56" name="Picture"/>
+                  <wp:docPr descr="" title="" id="59" name="Picture"/>
                   <a:graphic>
                     <a:graphicData uri="http://schemas.openxmlformats.org/drawingml/2006/picture">
                       <pic:pic>
                         <pic:nvPicPr>
-                          <pic:cNvPr descr="/Applications/Positron.app/Contents/Resources/app/quarto/share/formats/docx/note.png" id="57" name="Picture"/>
+                          <pic:cNvPr descr="/Applications/Positron.app/Contents/Resources/app/quarto/share/formats/docx/note.png" id="60" name="Picture"/>
                           <pic:cNvPicPr>
                             <a:picLocks noChangeArrowheads="1" noChangeAspect="1"/>
                           </pic:cNvPicPr>
@@ -6948,8 +7832,8 @@
         </w:pict>
       </w:r>
     </w:p>
-    <w:bookmarkEnd w:id="58"/>
-    <w:bookmarkStart w:id="61" w:name="Xd5a9ec79b1b4a9cb8da4df1aad8c26274cd2d35"/>
+    <w:bookmarkEnd w:id="61"/>
+    <w:bookmarkStart w:id="64" w:name="Xd5a9ec79b1b4a9cb8da4df1aad8c26274cd2d35"/>
     <w:p>
       <w:pPr>
         <w:pStyle w:val="Heading1"/>
@@ -7951,182 +8835,6 @@
           <w:rStyle w:val="NormalTok"/>
         </w:rPr>
         <w:t xml:space="preserve">)</w:t>
-      </w:r>
-    </w:p>
-    <w:tbl>
-      <w:tblPr>
-        <w:tblStyle w:val="Table"/>
-        <w:tblLook w:firstRow="0" w:lastRow="0" w:firstColumn="0" w:lastColumn="0" w:noHBand="0" w:noVBand="0" w:val="0000"/>
-        <w:tblBorders>
-          <w:top w:val="single" w:sz="4" w:space="0" w:color="00A047"/>
-          <w:left w:val="single" w:sz="24" w:space="0" w:color="00A047"/>
-          <w:bottom w:val="single" w:sz="4" w:space="0" w:color="00A047"/>
-          <w:right w:val="single" w:sz="4" w:space="0" w:color="00A047"/>
-        </w:tblBorders>
-        <w:tblCellMar>
-          <w:left w:w="144" w:type="dxa"/>
-          <w:right w:w="144" w:type="dxa"/>
-        </w:tblCellMar>
-        <w:tblLook w:firstRow="0" w:lastRow="0" w:firstColumn="0" w:lastColumn="0" w:noHBand="0" w:noVBand="0" w:val="0000"/>
-      </w:tblPr>
-      <w:tr>
-        <w:trPr>
-          <w:cantSplit/>
-        </w:trPr>
-        <w:tc>
-          <w:tcPr>
-            <w:shd w:color="auto" w:fill="ccf1e3" w:val="clear"/>
-            <w:tcMar>
-              <w:top w:w="92" w:type="dxa"/>
-              <w:bottom w:w="92" w:type="dxa"/>
-            </w:tcMar>
-          </w:tcPr>
-          <w:p>
-            <w:pPr>
-              <w:pStyle w:val="FirstParagraph"/>
-            </w:pPr>
-            <w:pPr>
-              <w:spacing w:before="0" w:after="0"/>
-              <w:textAlignment w:val="center"/>
-            </w:pPr>
-            <w:r>
-              <w:drawing>
-                <wp:inline>
-                  <wp:extent cx="152400" cy="152400"/>
-                  <wp:effectExtent b="0" l="0" r="0" t="0"/>
-                  <wp:docPr descr="" title="" id="59" name="Picture"/>
-                  <a:graphic>
-                    <a:graphicData uri="http://schemas.openxmlformats.org/drawingml/2006/picture">
-                      <pic:pic>
-                        <pic:nvPicPr>
-                          <pic:cNvPr descr="/Applications/Positron.app/Contents/Resources/app/quarto/share/formats/docx/tip.png" id="60" name="Picture"/>
-                          <pic:cNvPicPr>
-                            <a:picLocks noChangeArrowheads="1" noChangeAspect="1"/>
-                          </pic:cNvPicPr>
-                        </pic:nvPicPr>
-                        <pic:blipFill>
-                          <a:blip r:embed="rId27"/>
-                          <a:stretch>
-                            <a:fillRect/>
-                          </a:stretch>
-                        </pic:blipFill>
-                        <pic:spPr bwMode="auto">
-                          <a:xfrm>
-                            <a:off x="0" y="0"/>
-                            <a:ext cx="152400" cy="152400"/>
-                          </a:xfrm>
-                          <a:prstGeom prst="rect">
-                            <a:avLst/>
-                          </a:prstGeom>
-                          <a:noFill/>
-                          <a:ln w="9525">
-                            <a:noFill/>
-                            <a:headEnd/>
-                            <a:tailEnd/>
-                          </a:ln>
-                        </pic:spPr>
-                      </pic:pic>
-                    </a:graphicData>
-                  </a:graphic>
-                </wp:inline>
-              </w:drawing>
-            </w:r>
-            <w:r>
-              <w:t xml:space="preserve"> </w:t>
-            </w:r>
-            <w:r>
-              <w:t xml:space="preserve"> </w:t>
-            </w:r>
-            <w:r>
-              <w:t xml:space="preserve">Figure caption format</w:t>
-            </w:r>
-          </w:p>
-        </w:tc>
-      </w:tr>
-      <w:tr>
-        <w:trPr>
-          <w:cantSplit/>
-        </w:trPr>
-        <w:tc>
-          <w:tcPr>
-            <w:tcMar>
-              <w:top w:w="108" w:type="dxa"/>
-              <w:bottom w:w="108" w:type="dxa"/>
-            </w:tcMar>
-          </w:tcPr>
-          <w:p>
-            <w:pPr>
-              <w:pStyle w:val="BlockText"/>
-            </w:pPr>
-            <w:r>
-              <w:rPr>
-                <w:b/>
-                <w:bCs/>
-              </w:rPr>
-              <w:t xml:space="preserve">Figure 1.</w:t>
-            </w:r>
-            <w:r>
-              <w:t xml:space="preserve"> </w:t>
-            </w:r>
-            <w:r>
-              <w:t xml:space="preserve">Body mass (g) of three penguin species from the Palmer</w:t>
-            </w:r>
-            <w:r>
-              <w:t xml:space="preserve"> </w:t>
-            </w:r>
-            <w:r>
-              <w:t xml:space="preserve">Archipelago. Boxplots show median and IQR; points show individual penguins.</w:t>
-            </w:r>
-            <w:r>
-              <w:t xml:space="preserve"> </w:t>
-            </w:r>
-            <w:r>
-              <w:t xml:space="preserve">Letters above boxes indicate Tukey HSD groupings — species sharing a letter</w:t>
-            </w:r>
-            <w:r>
-              <w:t xml:space="preserve"> </w:t>
-            </w:r>
-            <w:r>
-              <w:t xml:space="preserve">are not significantly different (α = 0.05). Gentoo penguins were</w:t>
-            </w:r>
-            <w:r>
-              <w:t xml:space="preserve"> </w:t>
-            </w:r>
-            <w:r>
-              <w:t xml:space="preserve">significantly heavier than both Adelie and Chinstrap penguins</w:t>
-            </w:r>
-            <w:r>
-              <w:t xml:space="preserve"> </w:t>
-            </w:r>
-            <w:r>
-              <w:t xml:space="preserve">(one-way ANOVA: F₂,₃₃₉ = 207.3, p &lt; 0.001, η² = 0.55);</w:t>
-            </w:r>
-            <w:r>
-              <w:t xml:space="preserve"> </w:t>
-            </w:r>
-            <w:r>
-              <w:t xml:space="preserve">Adelie and Chinstrap did not differ.</w:t>
-            </w:r>
-          </w:p>
-          <w:p/>
-        </w:tc>
-      </w:tr>
-    </w:tbl>
-    <w:p>
-      <w:r>
-        <w:pict>
-          <v:rect style="width:0;height:1.5pt" o:hralign="center" o:hrstd="t" o:hr="t"/>
-        </w:pict>
-      </w:r>
-    </w:p>
-    <w:bookmarkEnd w:id="61"/>
-    <w:bookmarkStart w:id="64" w:name="how-to-report-the-result"/>
-    <w:p>
-      <w:pPr>
-        <w:pStyle w:val="Heading1"/>
-      </w:pPr>
-      <w:r>
-        <w:t xml:space="preserve">9 · How to report the result</w:t>
       </w:r>
     </w:p>
     <w:tbl>
@@ -8214,7 +8922,7 @@
               <w:t xml:space="preserve"> </w:t>
             </w:r>
             <w:r>
-              <w:t xml:space="preserve">In-text reporting format</w:t>
+              <w:t xml:space="preserve">Figure caption format</w:t>
             </w:r>
           </w:p>
         </w:tc>
@@ -8235,54 +8943,53 @@
               <w:pStyle w:val="BlockText"/>
             </w:pPr>
             <w:r>
-              <w:t xml:space="preserve">“Body mass differed significantly among penguin species</w:t>
-            </w:r>
-            <w:r>
-              <w:t xml:space="preserve"> </w:t>
-            </w:r>
-            <w:r>
-              <w:t xml:space="preserve">(one-way ANOVA: F₂,₃₃₉ = 207.3, p &lt; 0.001, η² = 0.55).</w:t>
-            </w:r>
-            <w:r>
-              <w:t xml:space="preserve"> </w:t>
-            </w:r>
-            <w:r>
-              <w:t xml:space="preserve">Gentoo penguins (mean ± SE: 5076 ± 55 g) were significantly heavier than</w:t>
-            </w:r>
-            <w:r>
-              <w:t xml:space="preserve"> </w:t>
-            </w:r>
-            <w:r>
-              <w:t xml:space="preserve">both Adelie (3701 ± 48 g; Tukey HSD: p &lt; 0.001) and Chinstrap</w:t>
-            </w:r>
-            <w:r>
-              <w:t xml:space="preserve"> </w:t>
-            </w:r>
-            <w:r>
-              <w:t xml:space="preserve">(3733 ± 73 g; p &lt; 0.001) penguins. Adelie and Chinstrap did not differ</w:t>
-            </w:r>
-            <w:r>
-              <w:t xml:space="preserve"> </w:t>
-            </w:r>
-            <w:r>
-              <w:t xml:space="preserve">significantly from each other (p = 0.878).”</w:t>
-            </w:r>
-          </w:p>
-          <w:p>
-            <w:pPr>
-              <w:pStyle w:val="FirstParagraph"/>
-            </w:pPr>
-            <w:pPr>
-              <w:spacing w:after="16"/>
-            </w:pPr>
-            <w:r>
-              <w:t xml:space="preserve">Structure: overall test → effect size → pairwise follow-up. Never lead with</w:t>
-            </w:r>
-            <w:r>
-              <w:t xml:space="preserve"> </w:t>
-            </w:r>
-            <w:r>
-              <w:t xml:space="preserve">p — lead with the biology and use p as support.</w:t>
+              <w:rPr>
+                <w:b/>
+                <w:bCs/>
+              </w:rPr>
+              <w:t xml:space="preserve">Figure 1.</w:t>
+            </w:r>
+            <w:r>
+              <w:t xml:space="preserve"> </w:t>
+            </w:r>
+            <w:r>
+              <w:t xml:space="preserve">Body mass (g) of three penguin species from the Palmer</w:t>
+            </w:r>
+            <w:r>
+              <w:t xml:space="preserve"> </w:t>
+            </w:r>
+            <w:r>
+              <w:t xml:space="preserve">Archipelago. Boxplots show median and IQR; points show individual penguins.</w:t>
+            </w:r>
+            <w:r>
+              <w:t xml:space="preserve"> </w:t>
+            </w:r>
+            <w:r>
+              <w:t xml:space="preserve">Letters above boxes indicate Tukey HSD groupings — species sharing a letter</w:t>
+            </w:r>
+            <w:r>
+              <w:t xml:space="preserve"> </w:t>
+            </w:r>
+            <w:r>
+              <w:t xml:space="preserve">are not significantly different (α = 0.05). Gentoo penguins were</w:t>
+            </w:r>
+            <w:r>
+              <w:t xml:space="preserve"> </w:t>
+            </w:r>
+            <w:r>
+              <w:t xml:space="preserve">significantly heavier than both Adelie and Chinstrap penguins</w:t>
+            </w:r>
+            <w:r>
+              <w:t xml:space="preserve"> </w:t>
+            </w:r>
+            <w:r>
+              <w:t xml:space="preserve">(one-way ANOVA: F₂,₃₃₉ = 343.6, p &lt; 0.001, η² = 0.67);</w:t>
+            </w:r>
+            <w:r>
+              <w:t xml:space="preserve"> </w:t>
+            </w:r>
+            <w:r>
+              <w:t xml:space="preserve">Adelie and Chinstrap did not differ.</w:t>
             </w:r>
           </w:p>
           <w:p/>
@@ -8297,7 +9004,184 @@
       </w:r>
     </w:p>
     <w:bookmarkEnd w:id="64"/>
-    <w:bookmarkStart w:id="65" w:name="quick-reference"/>
+    <w:bookmarkStart w:id="67" w:name="how-to-report-the-result"/>
+    <w:p>
+      <w:pPr>
+        <w:pStyle w:val="Heading1"/>
+      </w:pPr>
+      <w:r>
+        <w:t xml:space="preserve">9 · How to report the result</w:t>
+      </w:r>
+    </w:p>
+    <w:tbl>
+      <w:tblPr>
+        <w:tblStyle w:val="Table"/>
+        <w:tblLook w:firstRow="0" w:lastRow="0" w:firstColumn="0" w:lastColumn="0" w:noHBand="0" w:noVBand="0" w:val="0000"/>
+        <w:tblBorders>
+          <w:top w:val="single" w:sz="4" w:space="0" w:color="00A047"/>
+          <w:left w:val="single" w:sz="24" w:space="0" w:color="00A047"/>
+          <w:bottom w:val="single" w:sz="4" w:space="0" w:color="00A047"/>
+          <w:right w:val="single" w:sz="4" w:space="0" w:color="00A047"/>
+        </w:tblBorders>
+        <w:tblCellMar>
+          <w:left w:w="144" w:type="dxa"/>
+          <w:right w:w="144" w:type="dxa"/>
+        </w:tblCellMar>
+        <w:tblLook w:firstRow="0" w:lastRow="0" w:firstColumn="0" w:lastColumn="0" w:noHBand="0" w:noVBand="0" w:val="0000"/>
+      </w:tblPr>
+      <w:tr>
+        <w:trPr>
+          <w:cantSplit/>
+        </w:trPr>
+        <w:tc>
+          <w:tcPr>
+            <w:shd w:color="auto" w:fill="ccf1e3" w:val="clear"/>
+            <w:tcMar>
+              <w:top w:w="92" w:type="dxa"/>
+              <w:bottom w:w="92" w:type="dxa"/>
+            </w:tcMar>
+          </w:tcPr>
+          <w:p>
+            <w:pPr>
+              <w:pStyle w:val="FirstParagraph"/>
+            </w:pPr>
+            <w:pPr>
+              <w:spacing w:before="0" w:after="0"/>
+              <w:textAlignment w:val="center"/>
+            </w:pPr>
+            <w:r>
+              <w:drawing>
+                <wp:inline>
+                  <wp:extent cx="152400" cy="152400"/>
+                  <wp:effectExtent b="0" l="0" r="0" t="0"/>
+                  <wp:docPr descr="" title="" id="65" name="Picture"/>
+                  <a:graphic>
+                    <a:graphicData uri="http://schemas.openxmlformats.org/drawingml/2006/picture">
+                      <pic:pic>
+                        <pic:nvPicPr>
+                          <pic:cNvPr descr="/Applications/Positron.app/Contents/Resources/app/quarto/share/formats/docx/tip.png" id="66" name="Picture"/>
+                          <pic:cNvPicPr>
+                            <a:picLocks noChangeArrowheads="1" noChangeAspect="1"/>
+                          </pic:cNvPicPr>
+                        </pic:nvPicPr>
+                        <pic:blipFill>
+                          <a:blip r:embed="rId27"/>
+                          <a:stretch>
+                            <a:fillRect/>
+                          </a:stretch>
+                        </pic:blipFill>
+                        <pic:spPr bwMode="auto">
+                          <a:xfrm>
+                            <a:off x="0" y="0"/>
+                            <a:ext cx="152400" cy="152400"/>
+                          </a:xfrm>
+                          <a:prstGeom prst="rect">
+                            <a:avLst/>
+                          </a:prstGeom>
+                          <a:noFill/>
+                          <a:ln w="9525">
+                            <a:noFill/>
+                            <a:headEnd/>
+                            <a:tailEnd/>
+                          </a:ln>
+                        </pic:spPr>
+                      </pic:pic>
+                    </a:graphicData>
+                  </a:graphic>
+                </wp:inline>
+              </w:drawing>
+            </w:r>
+            <w:r>
+              <w:t xml:space="preserve"> </w:t>
+            </w:r>
+            <w:r>
+              <w:t xml:space="preserve"> </w:t>
+            </w:r>
+            <w:r>
+              <w:t xml:space="preserve">In-text reporting format</w:t>
+            </w:r>
+          </w:p>
+        </w:tc>
+      </w:tr>
+      <w:tr>
+        <w:trPr>
+          <w:cantSplit/>
+        </w:trPr>
+        <w:tc>
+          <w:tcPr>
+            <w:tcMar>
+              <w:top w:w="108" w:type="dxa"/>
+              <w:bottom w:w="108" w:type="dxa"/>
+            </w:tcMar>
+          </w:tcPr>
+          <w:p>
+            <w:pPr>
+              <w:pStyle w:val="BlockText"/>
+            </w:pPr>
+            <w:r>
+              <w:t xml:space="preserve">“Body mass differed significantly among penguin species</w:t>
+            </w:r>
+            <w:r>
+              <w:t xml:space="preserve"> </w:t>
+            </w:r>
+            <w:r>
+              <w:t xml:space="preserve">(one-way ANOVA: F₂,₃₃₉ = 343.6, p &lt; 0.001, η² = 0.67).</w:t>
+            </w:r>
+            <w:r>
+              <w:t xml:space="preserve"> </w:t>
+            </w:r>
+            <w:r>
+              <w:t xml:space="preserve">Gentoo penguins (mean ± SE: 5076 ± 42 g) were significantly heavier than</w:t>
+            </w:r>
+            <w:r>
+              <w:t xml:space="preserve"> </w:t>
+            </w:r>
+            <w:r>
+              <w:t xml:space="preserve">both Adelie (3701 ± 38 g; Tukey HSD: p &lt; 0.001) and Chinstrap</w:t>
+            </w:r>
+            <w:r>
+              <w:t xml:space="preserve"> </w:t>
+            </w:r>
+            <w:r>
+              <w:t xml:space="preserve">(3733 ± 56 g; p &lt; 0.001) penguins. Adelie and Chinstrap did not differ</w:t>
+            </w:r>
+            <w:r>
+              <w:t xml:space="preserve"> </w:t>
+            </w:r>
+            <w:r>
+              <w:t xml:space="preserve">significantly from each other (p = 0.881).”</w:t>
+            </w:r>
+          </w:p>
+          <w:p>
+            <w:pPr>
+              <w:pStyle w:val="FirstParagraph"/>
+            </w:pPr>
+            <w:pPr>
+              <w:spacing w:after="16"/>
+            </w:pPr>
+            <w:r>
+              <w:t xml:space="preserve">Structure: overall test → effect size → pairwise follow-up. Never lead with</w:t>
+            </w:r>
+            <w:r>
+              <w:t xml:space="preserve"> </w:t>
+            </w:r>
+            <w:r>
+              <w:t xml:space="preserve">p — lead with the biology and use p as support.</w:t>
+            </w:r>
+          </w:p>
+          <w:p/>
+        </w:tc>
+      </w:tr>
+    </w:tbl>
+    <w:p>
+      <w:r>
+        <w:pict>
+          <v:rect style="width:0;height:1.5pt" o:hralign="center" o:hrstd="t" o:hr="t"/>
+        </w:pict>
+      </w:r>
+    </w:p>
+    <w:bookmarkEnd w:id="67"/>
+    <w:bookmarkStart w:id="68" w:name="quick-reference"/>
     <w:p>
       <w:pPr>
         <w:pStyle w:val="Heading1"/>
@@ -8379,7 +9263,7 @@
               <w:pStyle w:val="Compact"/>
             </w:pPr>
             <w:r>
-              <w:t xml:space="preserve">ANOVA table (Type III)</w:t>
+              <w:t xml:space="preserve">ANOVA table (Type II, the default)</w:t>
             </w:r>
           </w:p>
         </w:tc>
@@ -8393,7 +9277,7 @@
               <w:rPr>
                 <w:rStyle w:val="VerbatimChar"/>
               </w:rPr>
-              <w:t xml:space="preserve">car::Anova(model, type = "III")</w:t>
+              <w:t xml:space="preserve">car::Anova(model)</w:t>
             </w:r>
           </w:p>
         </w:tc>
@@ -8406,7 +9290,7 @@
               <w:pStyle w:val="Compact"/>
             </w:pPr>
             <w:r>
-              <w:t xml:space="preserve">Tidy output</w:t>
+              <w:t xml:space="preserve">ANOVA table (Type III)</w:t>
             </w:r>
           </w:p>
         </w:tc>
@@ -8420,7 +9304,35 @@
               <w:rPr>
                 <w:rStyle w:val="VerbatimChar"/>
               </w:rPr>
-              <w:t xml:space="preserve">broom::tidy(Anova(model, type = "III"))</w:t>
+              <w:t xml:space="preserve">options(contrasts = c("contr.sum", "contr.poly"))</w:t>
+            </w:r>
+            <w:r>
+              <w:t xml:space="preserve">,</w:t>
+            </w:r>
+            <w:r>
+              <w:t xml:space="preserve"> </w:t>
+            </w:r>
+            <w:r>
+              <w:rPr>
+                <w:b/>
+                <w:bCs/>
+              </w:rPr>
+              <w:t xml:space="preserve">refit</w:t>
+            </w:r>
+            <w:r>
+              <w:t xml:space="preserve">, then</w:t>
+            </w:r>
+            <w:r>
+              <w:t xml:space="preserve"> </w:t>
+            </w:r>
+            <w:r>
+              <w:rPr>
+                <w:rStyle w:val="VerbatimChar"/>
+              </w:rPr>
+              <w:t xml:space="preserve">car::Anova(model, type = 3)</w:t>
+            </w:r>
+            <w:r>
+              <w:t xml:space="preserve">, then set contrasts back</w:t>
             </w:r>
           </w:p>
         </w:tc>
@@ -8433,7 +9345,7 @@
               <w:pStyle w:val="Compact"/>
             </w:pPr>
             <w:r>
-              <w:t xml:space="preserve">Residuals vs Fitted</w:t>
+              <w:t xml:space="preserve">Tidy output</w:t>
             </w:r>
           </w:p>
         </w:tc>
@@ -8447,13 +9359,7 @@
               <w:rPr>
                 <w:rStyle w:val="VerbatimChar"/>
               </w:rPr>
-              <w:t xml:space="preserve">tibble(fitted = fitted(m), resid = residuals(m))</w:t>
-            </w:r>
-            <w:r>
-              <w:t xml:space="preserve"> </w:t>
-            </w:r>
-            <w:r>
-              <w:t xml:space="preserve">→ ggplot</w:t>
+              <w:t xml:space="preserve">broom::tidy(Anova(model))</w:t>
             </w:r>
           </w:p>
         </w:tc>
@@ -8466,7 +9372,7 @@
               <w:pStyle w:val="Compact"/>
             </w:pPr>
             <w:r>
-              <w:t xml:space="preserve">Q-Q plot of residuals</w:t>
+              <w:t xml:space="preserve">Residuals vs Fitted</w:t>
             </w:r>
           </w:p>
         </w:tc>
@@ -8480,7 +9386,13 @@
               <w:rPr>
                 <w:rStyle w:val="VerbatimChar"/>
               </w:rPr>
-              <w:t xml:space="preserve">ggplot(aes(sample = rstandard(m))) + stat_qq() + stat_qq_line()</w:t>
+              <w:t xml:space="preserve">tibble(fitted = fitted(m), resid = residuals(m))</w:t>
+            </w:r>
+            <w:r>
+              <w:t xml:space="preserve"> </w:t>
+            </w:r>
+            <w:r>
+              <w:t xml:space="preserve">→ ggplot</w:t>
             </w:r>
           </w:p>
         </w:tc>
@@ -8493,7 +9405,7 @@
               <w:pStyle w:val="Compact"/>
             </w:pPr>
             <w:r>
-              <w:t xml:space="preserve">Levene’s test</w:t>
+              <w:t xml:space="preserve">Q-Q plot of residuals</w:t>
             </w:r>
           </w:p>
         </w:tc>
@@ -8507,7 +9419,7 @@
               <w:rPr>
                 <w:rStyle w:val="VerbatimChar"/>
               </w:rPr>
-              <w:t xml:space="preserve">car::leveneTest(y ~ group, data = df)</w:t>
+              <w:t xml:space="preserve">ggplot(aes(sample = rstandard(m))) + stat_qq() + stat_qq_line()</w:t>
             </w:r>
           </w:p>
         </w:tc>
@@ -8520,7 +9432,7 @@
               <w:pStyle w:val="Compact"/>
             </w:pPr>
             <w:r>
-              <w:t xml:space="preserve">Shapiro-Wilk on residuals</w:t>
+              <w:t xml:space="preserve">Levene’s test</w:t>
             </w:r>
           </w:p>
         </w:tc>
@@ -8534,7 +9446,7 @@
               <w:rPr>
                 <w:rStyle w:val="VerbatimChar"/>
               </w:rPr>
-              <w:t xml:space="preserve">shapiro.test(residuals(model))</w:t>
+              <w:t xml:space="preserve">car::leveneTest(y ~ group, data = df)</w:t>
             </w:r>
           </w:p>
         </w:tc>
@@ -8547,7 +9459,7 @@
               <w:pStyle w:val="Compact"/>
             </w:pPr>
             <w:r>
-              <w:t xml:space="preserve">Estimated marginal means</w:t>
+              <w:t xml:space="preserve">Shapiro-Wilk on residuals</w:t>
             </w:r>
           </w:p>
         </w:tc>
@@ -8561,7 +9473,7 @@
               <w:rPr>
                 <w:rStyle w:val="VerbatimChar"/>
               </w:rPr>
-              <w:t xml:space="preserve">emmeans(model, ~ group)</w:t>
+              <w:t xml:space="preserve">shapiro.test(residuals(model))</w:t>
             </w:r>
           </w:p>
         </w:tc>
@@ -8574,7 +9486,7 @@
               <w:pStyle w:val="Compact"/>
             </w:pPr>
             <w:r>
-              <w:t xml:space="preserve">Pairwise contrasts</w:t>
+              <w:t xml:space="preserve">Estimated marginal means</w:t>
             </w:r>
           </w:p>
         </w:tc>
@@ -8588,7 +9500,7 @@
               <w:rPr>
                 <w:rStyle w:val="VerbatimChar"/>
               </w:rPr>
-              <w:t xml:space="preserve">pairs(emm, adjust = "tukey")</w:t>
+              <w:t xml:space="preserve">emmeans(model, ~ group)</w:t>
             </w:r>
           </w:p>
         </w:tc>
@@ -8601,7 +9513,7 @@
               <w:pStyle w:val="Compact"/>
             </w:pPr>
             <w:r>
-              <w:t xml:space="preserve">Compact letters (a,b,c)</w:t>
+              <w:t xml:space="preserve">Pairwise contrasts</w:t>
             </w:r>
           </w:p>
         </w:tc>
@@ -8615,7 +9527,7 @@
               <w:rPr>
                 <w:rStyle w:val="VerbatimChar"/>
               </w:rPr>
-              <w:t xml:space="preserve">cld(emm, adjust = "tukey", Letters = letters)</w:t>
+              <w:t xml:space="preserve">pairs(emm, adjust = "tukey")</w:t>
             </w:r>
           </w:p>
         </w:tc>
@@ -8628,7 +9540,7 @@
               <w:pStyle w:val="Compact"/>
             </w:pPr>
             <w:r>
-              <w:t xml:space="preserve">Eta-squared</w:t>
+              <w:t xml:space="preserve">Compact letters (a,b,c)</w:t>
             </w:r>
           </w:p>
         </w:tc>
@@ -8642,28 +9554,7 @@
               <w:rPr>
                 <w:rStyle w:val="VerbatimChar"/>
               </w:rPr>
-              <w:t xml:space="preserve">SS_between / SS_total</w:t>
-            </w:r>
-            <w:r>
-              <w:t xml:space="preserve"> </w:t>
-            </w:r>
-            <w:r>
-              <w:t xml:space="preserve">from</w:t>
-            </w:r>
-            <w:r>
-              <w:t xml:space="preserve"> </w:t>
-            </w:r>
-            <w:r>
-              <w:rPr>
-                <w:rStyle w:val="VerbatimChar"/>
-              </w:rPr>
-              <w:t xml:space="preserve">fitted()</w:t>
-            </w:r>
-            <w:r>
-              <w:t xml:space="preserve"> </w:t>
-            </w:r>
-            <w:r>
-              <w:t xml:space="preserve">and raw y</w:t>
+              <w:t xml:space="preserve">cld(emm, adjust = "tukey", Letters = letters)</w:t>
             </w:r>
           </w:p>
         </w:tc>
@@ -8676,7 +9567,7 @@
               <w:pStyle w:val="Compact"/>
             </w:pPr>
             <w:r>
-              <w:t xml:space="preserve">Welch one-way (unequal var)</w:t>
+              <w:t xml:space="preserve">Eta-squared</w:t>
             </w:r>
           </w:p>
         </w:tc>
@@ -8690,7 +9581,28 @@
               <w:rPr>
                 <w:rStyle w:val="VerbatimChar"/>
               </w:rPr>
-              <w:t xml:space="preserve">oneway.test(y ~ group, data = df, var.equal = FALSE)</w:t>
+              <w:t xml:space="preserve">SS_between / SS_total</w:t>
+            </w:r>
+            <w:r>
+              <w:t xml:space="preserve"> </w:t>
+            </w:r>
+            <w:r>
+              <w:t xml:space="preserve">from</w:t>
+            </w:r>
+            <w:r>
+              <w:t xml:space="preserve"> </w:t>
+            </w:r>
+            <w:r>
+              <w:rPr>
+                <w:rStyle w:val="VerbatimChar"/>
+              </w:rPr>
+              <w:t xml:space="preserve">fitted()</w:t>
+            </w:r>
+            <w:r>
+              <w:t xml:space="preserve"> </w:t>
+            </w:r>
+            <w:r>
+              <w:t xml:space="preserve">and raw y</w:t>
             </w:r>
           </w:p>
         </w:tc>
@@ -8703,7 +9615,7 @@
               <w:pStyle w:val="Compact"/>
             </w:pPr>
             <w:r>
-              <w:t xml:space="preserve">Add letters to plot</w:t>
+              <w:t xml:space="preserve">Welch one-way (unequal var)</w:t>
             </w:r>
           </w:p>
         </w:tc>
@@ -8717,6 +9629,33 @@
               <w:rPr>
                 <w:rStyle w:val="VerbatimChar"/>
               </w:rPr>
+              <w:t xml:space="preserve">oneway.test(y ~ group, data = df, var.equal = FALSE)</w:t>
+            </w:r>
+          </w:p>
+        </w:tc>
+      </w:tr>
+      <w:tr>
+        <w:tc>
+          <w:tcPr/>
+          <w:p>
+            <w:pPr>
+              <w:pStyle w:val="Compact"/>
+            </w:pPr>
+            <w:r>
+              <w:t xml:space="preserve">Add letters to plot</w:t>
+            </w:r>
+          </w:p>
+        </w:tc>
+        <w:tc>
+          <w:tcPr/>
+          <w:p>
+            <w:pPr>
+              <w:pStyle w:val="Compact"/>
+            </w:pPr>
+            <w:r>
+              <w:rPr>
+                <w:rStyle w:val="VerbatimChar"/>
+              </w:rPr>
               <w:t xml:space="preserve">geom_text(data = cld_df, aes(x=group, y=ymax+offset, label=.group))</w:t>
             </w:r>
           </w:p>
@@ -8754,7 +9693,7 @@
         <w:t xml:space="preserve">Next: Common Code 13 — Joining data frames.</w:t>
       </w:r>
     </w:p>
-    <w:bookmarkEnd w:id="65"/>
+    <w:bookmarkEnd w:id="68"/>
     <w:sectPr>
       <w:pgSz w:h="15840" w:w="12240"/>
       <w:pgMar w:bottom="720" w:footer="432" w:gutter="0" w:header="432" w:left="720" w:right="1008" w:top="720"/>

</xml_diff>